<commit_message>
Final manuscript build: equation-markup fixes, recompiled PDF, cover letter and supplement
Co-Authored-By: Claude Sonnet 5.5 <noreply@anthropic.com>
</commit_message>
<xml_diff>
--- a/manuscript/EPJC_Late_Time_Vacuum_Decay.docx
+++ b/manuscript/EPJC_Late_Time_Vacuum_Decay.docx
@@ -931,12 +931,24 @@
           <w:b w:val="0"/>
           <w:i w:val="0"/>
         </w:rPr>
-        <w:t xml:space="preserve"> GeV</w:t>
+        <w:t xml:space="preserve"> </w:t>
       </w:r>
       <m:oMath>
-        <m:r>
-          <m:t xml:space="preserve">^4</m:t>
-        </m:r>
+        <m:sSup>
+          <m:e>
+            <m:r>
+              <m:rPr>
+                <m:sty m:val="p"/>
+              </m:rPr>
+              <m:t xml:space="preserve">GeV</m:t>
+            </m:r>
+          </m:e>
+          <m:sup>
+            <m:r>
+              <m:t xml:space="preserve">4</m:t>
+            </m:r>
+          </m:sup>
+        </m:sSup>
       </m:oMath>
       <w:r>
         <w:rPr>
@@ -964,36 +976,72 @@
         <m:r>
           <m:t xml:space="preserve">67.66</m:t>
         </m:r>
-      </m:oMath>
-      <w:r>
-        <w:rPr>
-          <w:b w:val="0"/>
-          <w:i w:val="0"/>
-        </w:rPr>
-        <w:t xml:space="preserve"> km s</w:t>
-      </w:r>
-      <m:oMath>
-        <m:r>
-          <m:t xml:space="preserve">^</m:t>
-        </m:r>
-        <m:r>
-          <m:t xml:space="preserve">−1</m:t>
-        </m:r>
-      </m:oMath>
-      <w:r>
-        <w:rPr>
-          <w:b w:val="0"/>
-          <w:i w:val="0"/>
-        </w:rPr>
-        <w:t xml:space="preserve"> Mpc</w:t>
-      </w:r>
-      <m:oMath>
-        <m:r>
-          <m:t xml:space="preserve">^</m:t>
-        </m:r>
-        <m:r>
-          <m:t xml:space="preserve">−1</m:t>
-        </m:r>
+        <m:r>
+          <m:rPr>
+            <m:sty m:val="p"/>
+          </m:rPr>
+          <m:t xml:space="preserve"> </m:t>
+        </m:r>
+        <m:r>
+          <m:rPr>
+            <m:sty m:val="p"/>
+          </m:rPr>
+          <m:t xml:space="preserve">km</m:t>
+        </m:r>
+        <m:r>
+          <m:rPr>
+            <m:sty m:val="p"/>
+          </m:rPr>
+          <m:t xml:space="preserve"> </m:t>
+        </m:r>
+        <m:sSup>
+          <m:e>
+            <m:r>
+              <m:rPr>
+                <m:sty m:val="p"/>
+              </m:rPr>
+              <m:t xml:space="preserve">s</m:t>
+            </m:r>
+          </m:e>
+          <m:sup>
+            <m:r>
+              <m:rPr>
+                <m:sty m:val="p"/>
+              </m:rPr>
+              <m:t xml:space="preserve">−1</m:t>
+            </m:r>
+          </m:sup>
+        </m:sSup>
+        <m:r>
+          <m:rPr>
+            <m:sty m:val="p"/>
+          </m:rPr>
+          <m:t xml:space="preserve"> </m:t>
+        </m:r>
+        <m:r>
+          <m:rPr>
+            <m:sty m:val="p"/>
+          </m:rPr>
+          <m:t xml:space="preserve">Mp</m:t>
+        </m:r>
+        <m:sSup>
+          <m:e>
+            <m:r>
+              <m:rPr>
+                <m:sty m:val="p"/>
+              </m:rPr>
+              <m:t xml:space="preserve">c</m:t>
+            </m:r>
+          </m:e>
+          <m:sup>
+            <m:r>
+              <m:rPr>
+                <m:sty m:val="p"/>
+              </m:rPr>
+              <m:t xml:space="preserve">−1</m:t>
+            </m:r>
+          </m:sup>
+        </m:sSup>
       </m:oMath>
       <w:r>
         <w:rPr>
@@ -3691,7 +3739,7 @@
                 <w:i w:val="0"/>
                 <w:sz w:val="17"/>
               </w:rPr>
-              <w:t>Thin-wall limit: B/B</w:t>
+              <w:t xml:space="preserve">Thin-wall limit: </w:t>
             </w:r>
             <m:oMath>
               <m:r>
@@ -3699,18 +3747,31 @@
                   <w:sz w:val="17"/>
                   <w:szCs w:val="17"/>
                 </w:rPr>
-                <m:t xml:space="preserve">_</m:t>
+                <m:t xml:space="preserve">B/</m:t>
               </m:r>
-              <m:r>
-                <m:rPr>
-                  <m:sty m:val="p"/>
-                </m:rPr>
-                <w:rPr>
-                  <w:sz w:val="17"/>
-                  <w:szCs w:val="17"/>
-                </w:rPr>
-                <m:t xml:space="preserve">thin</m:t>
-              </m:r>
+              <m:sSub>
+                <m:e>
+                  <m:r>
+                    <w:rPr>
+                      <w:sz w:val="17"/>
+                      <w:szCs w:val="17"/>
+                    </w:rPr>
+                    <m:t xml:space="preserve">B</m:t>
+                  </m:r>
+                </m:e>
+                <m:sub>
+                  <m:r>
+                    <m:rPr>
+                      <m:sty m:val="p"/>
+                    </m:rPr>
+                    <w:rPr>
+                      <w:sz w:val="17"/>
+                      <w:szCs w:val="17"/>
+                    </w:rPr>
+                    <m:t xml:space="preserve">thin</m:t>
+                  </m:r>
+                </m:sub>
+              </m:sSub>
             </m:oMath>
             <w:r>
               <w:rPr>

</xml_diff>